<commit_message>
Point report source link to this repo; add PDF versions of report and slides
Co-Authored-By: Claude Opus 5.5 <noreply@anthropic.com>
Claude-Session: https://claude.ai/code/session_01FNCCHJM4a9NtCwN3j6hQhR
</commit_message>
<xml_diff>
--- a/docs/Invoice_Agents_Report_Saafalya_Sengupta.docx
+++ b/docs/Invoice_Agents_Report_Saafalya_Sengupta.docx
@@ -117,7 +117,7 @@
             <w:color w:val="333333"/>
             <w:u w:val="single"/>
           </w:rPr>
-          <w:t xml:space="preserve">https://github.com/swastikgavhane789/invoice-three-way-match-agents</w:t>
+          <w:t xml:space="preserve">https://github.com/Saafalya/invoice_agents</w:t>
         </w:r>
       </w:hyperlink>
     </w:p>
@@ -2893,7 +2893,7 @@
             <w:color w:val="333333"/>
             <w:u w:val="single"/>
           </w:rPr>
-          <w:t xml:space="preserve">https://github.com/swastikgavhane789/invoice-three-way-match-agents</w:t>
+          <w:t xml:space="preserve">https://github.com/Saafalya/invoice_agents</w:t>
         </w:r>
       </w:hyperlink>
     </w:p>
@@ -2914,7 +2914,7 @@
           <w:sz w:val="20"/>
           <w:szCs w:val="20"/>
         </w:rPr>
-        <w:t xml:space="preserve">https://github.com/swastikgavhane789/invoice-three-way-match-agents.git</w:t>
+        <w:t xml:space="preserve">https://github.com/Saafalya/invoice_agents.git</w:t>
       </w:r>
     </w:p>
     <w:sectPr>

</xml_diff>